<commit_message>
Update docs and add model files
Updated 'Documentação/Documento de Visão e Especificação de Requisitos.docx' and modified 'Modelo Conceitual/Modelo conceitual Rifa.brM3'. Added temporary Word file 'Documentação/~WRL2264.tmp' and new model image 'Modelo Conceitual/versão 2 de modelo conceitual.png'. These are binary asset updates reflecting a revised requirements document and an updated conceptual model (version 2).
</commit_message>
<xml_diff>
--- a/Documentação/Documento de Visão e Especificação de Requisitos.docx
+++ b/Documentação/Documento de Visão e Especificação de Requisitos.docx
@@ -1,6 +1,6 @@
 
 <file path=word/document.xml><?xml version="1.0" encoding="utf-8"?>
-<w:document xmlns:wpc="http://schemas.microsoft.com/office/word/2010/wordprocessingCanvas" xmlns:cx="http://schemas.microsoft.com/office/drawing/2014/chartex" xmlns:cx1="http://schemas.microsoft.com/office/drawing/2015/9/8/chartex" xmlns:cx2="http://schemas.microsoft.com/office/drawing/2015/10/21/chartex" xmlns:cx3="http://schemas.microsoft.com/office/drawing/2016/5/9/chartex" xmlns:cx4="http://schemas.microsoft.com/office/drawing/2016/5/10/chartex" xmlns:cx5="http://schemas.microsoft.com/office/drawing/2016/5/11/chartex" xmlns:cx6="http://schemas.microsoft.com/office/drawing/2016/5/12/chartex" xmlns:cx7="http://schemas.microsoft.com/office/drawing/2016/5/13/chartex" xmlns:cx8="http://schemas.microsoft.com/office/drawing/2016/5/14/chartex" xmlns:mc="http://schemas.openxmlformats.org/markup-compatibility/2006" xmlns:aink="http://schemas.microsoft.com/office/drawing/2016/ink" xmlns:am3d="http://schemas.microsoft.com/office/drawing/2017/model3d" xmlns:o="urn:schemas-microsoft-com:office:office" xmlns:oel="http://schemas.microsoft.com/office/2019/extlst" xmlns:r="http://schemas.openxmlformats.org/officeDocument/2006/relationships" xmlns:m="http://schemas.openxmlformats.org/officeDocument/2006/math" xmlns:v="urn:schemas-microsoft-com:vml" xmlns:wp14="http://schemas.microsoft.com/office/word/2010/wordprocessingDrawing" xmlns:wp="http://schemas.openxmlformats.org/drawingml/2006/wordprocessingDrawing" xmlns:w10="urn:schemas-microsoft-com:office:word" xmlns:w="http://schemas.openxmlformats.org/wordprocessingml/2006/main" xmlns:w14="http://schemas.microsoft.com/office/word/2010/wordml" xmlns:w15="http://schemas.microsoft.com/office/word/2012/wordml" xmlns:w16cex="http://schemas.microsoft.com/office/word/2018/wordml/cex" xmlns:w16cid="http://schemas.microsoft.com/office/word/2016/wordml/cid" xmlns:w16="http://schemas.microsoft.com/office/word/2018/wordml" xmlns:w16sdtdh="http://schemas.microsoft.com/office/word/2020/wordml/sdtdatahash" xmlns:w16se="http://schemas.microsoft.com/office/word/2015/wordml/symex" xmlns:wpg="http://schemas.microsoft.com/office/word/2010/wordprocessingGroup" xmlns:wpi="http://schemas.microsoft.com/office/word/2010/wordprocessingInk" xmlns:wne="http://schemas.microsoft.com/office/word/2006/wordml" xmlns:wps="http://schemas.microsoft.com/office/word/2010/wordprocessingShape" mc:Ignorable="w14 w15 w16se w16cid w16 w16cex w16sdtdh wp14">
+<w:document xmlns:wpc="http://schemas.microsoft.com/office/word/2010/wordprocessingCanvas" xmlns:cx="http://schemas.microsoft.com/office/drawing/2014/chartex" xmlns:cx1="http://schemas.microsoft.com/office/drawing/2015/9/8/chartex" xmlns:cx2="http://schemas.microsoft.com/office/drawing/2015/10/21/chartex" xmlns:cx3="http://schemas.microsoft.com/office/drawing/2016/5/9/chartex" xmlns:cx4="http://schemas.microsoft.com/office/drawing/2016/5/10/chartex" xmlns:cx5="http://schemas.microsoft.com/office/drawing/2016/5/11/chartex" xmlns:cx6="http://schemas.microsoft.com/office/drawing/2016/5/12/chartex" xmlns:cx7="http://schemas.microsoft.com/office/drawing/2016/5/13/chartex" xmlns:cx8="http://schemas.microsoft.com/office/drawing/2016/5/14/chartex" xmlns:mc="http://schemas.openxmlformats.org/markup-compatibility/2006" xmlns:aink="http://schemas.microsoft.com/office/drawing/2016/ink" xmlns:am3d="http://schemas.microsoft.com/office/drawing/2017/model3d" xmlns:o="urn:schemas-microsoft-com:office:office" xmlns:oel="http://schemas.microsoft.com/office/2019/extlst" xmlns:r="http://schemas.openxmlformats.org/officeDocument/2006/relationships" xmlns:m="http://schemas.openxmlformats.org/officeDocument/2006/math" xmlns:v="urn:schemas-microsoft-com:vml" xmlns:wp14="http://schemas.microsoft.com/office/word/2010/wordprocessingDrawing" xmlns:wp="http://schemas.openxmlformats.org/drawingml/2006/wordprocessingDrawing" xmlns:w10="urn:schemas-microsoft-com:office:word" xmlns:w="http://schemas.openxmlformats.org/wordprocessingml/2006/main" xmlns:w14="http://schemas.microsoft.com/office/word/2010/wordml" xmlns:w15="http://schemas.microsoft.com/office/word/2012/wordml" xmlns:w16cex="http://schemas.microsoft.com/office/word/2018/wordml/cex" xmlns:w16cid="http://schemas.microsoft.com/office/word/2016/wordml/cid" xmlns:w16="http://schemas.microsoft.com/office/word/2018/wordml" xmlns:w16du="http://schemas.microsoft.com/office/word/2023/wordml/word16du" xmlns:w16sdtdh="http://schemas.microsoft.com/office/word/2020/wordml/sdtdatahash" xmlns:w16sdtfl="http://schemas.microsoft.com/office/word/2024/wordml/sdtformatlock" xmlns:w16se="http://schemas.microsoft.com/office/word/2015/wordml/symex" xmlns:wpg="http://schemas.microsoft.com/office/word/2010/wordprocessingGroup" xmlns:wpi="http://schemas.microsoft.com/office/word/2010/wordprocessingInk" xmlns:wne="http://schemas.microsoft.com/office/word/2006/wordml" xmlns:wps="http://schemas.microsoft.com/office/word/2010/wordprocessingShape" mc:Ignorable="w14 w15 w16se w16cid w16 w16cex w16sdtdh w16sdtfl w16du wp14">
   <w:body>
     <w:p>
       <w:pPr>
@@ -163,8 +163,10 @@
         <w:tblBorders>
           <w:top w:val="single" w:sz="6" w:space="0" w:color="000000" w:themeColor="text1"/>
           <w:left w:val="single" w:sz="6" w:space="0" w:color="000000" w:themeColor="text1"/>
-          <w:bottom w:val="single" w:sz="6" w:space="0" w:color="000000" w:themeColor="text1"/>
+          <w:bottom w:val="single" w:sz="4" w:space="0" w:color="auto"/>
           <w:right w:val="single" w:sz="6" w:space="0" w:color="000000" w:themeColor="text1"/>
+          <w:insideH w:val="single" w:sz="6" w:space="0" w:color="000000" w:themeColor="text1"/>
+          <w:insideV w:val="single" w:sz="6" w:space="0" w:color="000000" w:themeColor="text1"/>
         </w:tblBorders>
         <w:tblLook w:val="06A0" w:firstRow="1" w:lastRow="0" w:firstColumn="1" w:lastColumn="0" w:noHBand="1" w:noVBand="1"/>
       </w:tblPr>
@@ -181,12 +183,6 @@
         <w:tc>
           <w:tcPr>
             <w:tcW w:w="1291" w:type="dxa"/>
-            <w:tcBorders>
-              <w:top w:val="single" w:sz="6" w:space="0" w:color="000000" w:themeColor="text1"/>
-              <w:left w:val="single" w:sz="6" w:space="0" w:color="000000" w:themeColor="text1"/>
-              <w:bottom w:val="single" w:sz="6" w:space="0" w:color="000000" w:themeColor="text1"/>
-              <w:right w:val="single" w:sz="6" w:space="0" w:color="000000" w:themeColor="text1"/>
-            </w:tcBorders>
             <w:tcMar>
               <w:top w:w="120" w:type="dxa"/>
               <w:left w:w="120" w:type="dxa"/>
@@ -211,13 +207,7 @@
         </w:tc>
         <w:tc>
           <w:tcPr>
-            <w:tcW w:w="1873" w:type="dxa"/>
-            <w:tcBorders>
-              <w:top w:val="single" w:sz="6" w:space="0" w:color="000000" w:themeColor="text1"/>
-              <w:left w:val="single" w:sz="6" w:space="0" w:color="000000" w:themeColor="text1"/>
-              <w:bottom w:val="single" w:sz="6" w:space="0" w:color="000000" w:themeColor="text1"/>
-              <w:right w:val="single" w:sz="6" w:space="0" w:color="000000" w:themeColor="text1"/>
-            </w:tcBorders>
+            <w:tcW w:w="1872" w:type="dxa"/>
             <w:tcMar>
               <w:top w:w="120" w:type="dxa"/>
               <w:left w:w="120" w:type="dxa"/>
@@ -242,13 +232,7 @@
         </w:tc>
         <w:tc>
           <w:tcPr>
-            <w:tcW w:w="2392" w:type="dxa"/>
-            <w:tcBorders>
-              <w:top w:val="single" w:sz="6" w:space="0" w:color="000000" w:themeColor="text1"/>
-              <w:left w:val="single" w:sz="6" w:space="0" w:color="000000" w:themeColor="text1"/>
-              <w:bottom w:val="single" w:sz="6" w:space="0" w:color="000000" w:themeColor="text1"/>
-              <w:right w:val="single" w:sz="6" w:space="0" w:color="000000" w:themeColor="text1"/>
-            </w:tcBorders>
+            <w:tcW w:w="2390" w:type="dxa"/>
             <w:tcMar>
               <w:top w:w="120" w:type="dxa"/>
               <w:left w:w="120" w:type="dxa"/>
@@ -273,13 +257,7 @@
         </w:tc>
         <w:tc>
           <w:tcPr>
-            <w:tcW w:w="3460" w:type="dxa"/>
-            <w:tcBorders>
-              <w:top w:val="single" w:sz="6" w:space="0" w:color="000000" w:themeColor="text1"/>
-              <w:left w:val="single" w:sz="6" w:space="0" w:color="000000" w:themeColor="text1"/>
-              <w:bottom w:val="single" w:sz="6" w:space="0" w:color="000000" w:themeColor="text1"/>
-              <w:right w:val="single" w:sz="6" w:space="0" w:color="000000" w:themeColor="text1"/>
-            </w:tcBorders>
+            <w:tcW w:w="3457" w:type="dxa"/>
             <w:tcMar>
               <w:top w:w="120" w:type="dxa"/>
               <w:left w:w="120" w:type="dxa"/>
@@ -310,12 +288,6 @@
         <w:tc>
           <w:tcPr>
             <w:tcW w:w="1291" w:type="dxa"/>
-            <w:tcBorders>
-              <w:top w:val="single" w:sz="6" w:space="0" w:color="000000" w:themeColor="text1"/>
-              <w:left w:val="single" w:sz="6" w:space="0" w:color="000000" w:themeColor="text1"/>
-              <w:bottom w:val="single" w:sz="6" w:space="0" w:color="000000" w:themeColor="text1"/>
-              <w:right w:val="single" w:sz="6" w:space="0" w:color="000000" w:themeColor="text1"/>
-            </w:tcBorders>
             <w:tcMar>
               <w:top w:w="120" w:type="dxa"/>
               <w:left w:w="120" w:type="dxa"/>
@@ -335,13 +307,7 @@
         </w:tc>
         <w:tc>
           <w:tcPr>
-            <w:tcW w:w="1873" w:type="dxa"/>
-            <w:tcBorders>
-              <w:top w:val="single" w:sz="6" w:space="0" w:color="000000" w:themeColor="text1"/>
-              <w:left w:val="single" w:sz="6" w:space="0" w:color="000000" w:themeColor="text1"/>
-              <w:bottom w:val="single" w:sz="6" w:space="0" w:color="000000" w:themeColor="text1"/>
-              <w:right w:val="single" w:sz="6" w:space="0" w:color="000000" w:themeColor="text1"/>
-            </w:tcBorders>
+            <w:tcW w:w="1872" w:type="dxa"/>
             <w:tcMar>
               <w:top w:w="120" w:type="dxa"/>
               <w:left w:w="120" w:type="dxa"/>
@@ -361,13 +327,7 @@
         </w:tc>
         <w:tc>
           <w:tcPr>
-            <w:tcW w:w="2392" w:type="dxa"/>
-            <w:tcBorders>
-              <w:top w:val="single" w:sz="6" w:space="0" w:color="000000" w:themeColor="text1"/>
-              <w:left w:val="single" w:sz="6" w:space="0" w:color="000000" w:themeColor="text1"/>
-              <w:bottom w:val="single" w:sz="6" w:space="0" w:color="000000" w:themeColor="text1"/>
-              <w:right w:val="single" w:sz="6" w:space="0" w:color="000000" w:themeColor="text1"/>
-            </w:tcBorders>
+            <w:tcW w:w="2390" w:type="dxa"/>
             <w:tcMar>
               <w:top w:w="120" w:type="dxa"/>
               <w:left w:w="120" w:type="dxa"/>
@@ -408,13 +368,7 @@
         </w:tc>
         <w:tc>
           <w:tcPr>
-            <w:tcW w:w="3460" w:type="dxa"/>
-            <w:tcBorders>
-              <w:top w:val="single" w:sz="6" w:space="0" w:color="000000" w:themeColor="text1"/>
-              <w:left w:val="single" w:sz="6" w:space="0" w:color="000000" w:themeColor="text1"/>
-              <w:bottom w:val="single" w:sz="6" w:space="0" w:color="000000" w:themeColor="text1"/>
-              <w:right w:val="single" w:sz="6" w:space="0" w:color="000000" w:themeColor="text1"/>
-            </w:tcBorders>
+            <w:tcW w:w="3457" w:type="dxa"/>
             <w:tcMar>
               <w:top w:w="120" w:type="dxa"/>
               <w:left w:w="120" w:type="dxa"/>
@@ -430,6 +384,104 @@
             <w:r>
               <w:t>Criação do documento</w:t>
             </w:r>
+          </w:p>
+        </w:tc>
+      </w:tr>
+      <w:tr>
+        <w:trPr>
+          <w:trHeight w:val="300"/>
+        </w:trPr>
+        <w:tc>
+          <w:tcPr>
+            <w:tcW w:w="1291" w:type="dxa"/>
+            <w:tcMar>
+              <w:top w:w="120" w:type="dxa"/>
+              <w:left w:w="120" w:type="dxa"/>
+              <w:bottom w:w="120" w:type="dxa"/>
+              <w:right w:w="120" w:type="dxa"/>
+            </w:tcMar>
+            <w:vAlign w:val="center"/>
+          </w:tcPr>
+          <w:p>
+            <w:pPr>
+              <w:spacing w:after="0"/>
+            </w:pPr>
+            <w:r>
+              <w:t>1.1</w:t>
+            </w:r>
+          </w:p>
+        </w:tc>
+        <w:tc>
+          <w:tcPr>
+            <w:tcW w:w="1872" w:type="dxa"/>
+            <w:tcMar>
+              <w:top w:w="120" w:type="dxa"/>
+              <w:left w:w="120" w:type="dxa"/>
+              <w:bottom w:w="120" w:type="dxa"/>
+              <w:right w:w="120" w:type="dxa"/>
+            </w:tcMar>
+            <w:vAlign w:val="center"/>
+          </w:tcPr>
+          <w:p>
+            <w:pPr>
+              <w:spacing w:after="0"/>
+            </w:pPr>
+            <w:r>
+              <w:t>28/03/2026</w:t>
+            </w:r>
+          </w:p>
+        </w:tc>
+        <w:tc>
+          <w:tcPr>
+            <w:tcW w:w="2390" w:type="dxa"/>
+            <w:tcMar>
+              <w:top w:w="120" w:type="dxa"/>
+              <w:left w:w="120" w:type="dxa"/>
+              <w:bottom w:w="120" w:type="dxa"/>
+              <w:right w:w="120" w:type="dxa"/>
+            </w:tcMar>
+            <w:vAlign w:val="center"/>
+          </w:tcPr>
+          <w:p>
+            <w:pPr>
+              <w:spacing w:after="0"/>
+            </w:pPr>
+            <w:r>
+              <w:t xml:space="preserve">Rui Magalhães </w:t>
+            </w:r>
+          </w:p>
+        </w:tc>
+        <w:tc>
+          <w:tcPr>
+            <w:tcW w:w="3457" w:type="dxa"/>
+            <w:tcMar>
+              <w:top w:w="120" w:type="dxa"/>
+              <w:left w:w="120" w:type="dxa"/>
+              <w:bottom w:w="120" w:type="dxa"/>
+              <w:right w:w="120" w:type="dxa"/>
+            </w:tcMar>
+            <w:vAlign w:val="center"/>
+          </w:tcPr>
+          <w:p>
+            <w:pPr>
+              <w:spacing w:after="0"/>
+            </w:pPr>
+            <w:r>
+              <w:t xml:space="preserve">Modificações dos nomes </w:t>
+            </w:r>
+            <w:proofErr w:type="gramStart"/>
+            <w:r>
+              <w:t>das ids</w:t>
+            </w:r>
+            <w:proofErr w:type="gramEnd"/>
+            <w:r>
+              <w:t xml:space="preserve"> e adicionado mais um atributo no sorteio o </w:t>
+            </w:r>
+            <w:proofErr w:type="spellStart"/>
+            <w:r>
+              <w:t>bilhete_id</w:t>
+            </w:r>
+            <w:proofErr w:type="spellEnd"/>
           </w:p>
         </w:tc>
       </w:tr>
@@ -633,6 +685,7 @@
         <w:rPr>
           <w:rFonts w:ascii="Aptos" w:eastAsia="Aptos" w:hAnsi="Aptos" w:cs="Aptos"/>
         </w:rPr>
+        <w:lastRenderedPageBreak/>
         <w:t xml:space="preserve">2.3 </w:t>
       </w:r>
       <w:hyperlink r:id="rId12" w:anchor="23-descri%C3%A7%C3%A3o-da-solu%C3%A7%C3%A3o">
@@ -703,7 +756,6 @@
         <w:rPr>
           <w:rFonts w:ascii="Aptos" w:eastAsia="Aptos" w:hAnsi="Aptos" w:cs="Aptos"/>
         </w:rPr>
-        <w:lastRenderedPageBreak/>
         <w:t xml:space="preserve">3.2 </w:t>
       </w:r>
       <w:hyperlink r:id="rId15" w:anchor="32-perfis-de-usu%C3%A1rio">
@@ -1247,6 +1299,7 @@
         <w:rPr>
           <w:rFonts w:ascii="Aptos" w:eastAsia="Aptos" w:hAnsi="Aptos" w:cs="Aptos"/>
         </w:rPr>
+        <w:lastRenderedPageBreak/>
         <w:t>Relatórios gerenciais em PDF/Excel.</w:t>
       </w:r>
     </w:p>
@@ -1261,7 +1314,6 @@
           <w:b/>
           <w:bCs/>
         </w:rPr>
-        <w:lastRenderedPageBreak/>
         <w:t>1.3 Definições, acrônimos e abreviações</w:t>
       </w:r>
     </w:p>
@@ -1975,7 +2027,11 @@
               <w:spacing w:after="0"/>
             </w:pPr>
             <w:r>
-              <w:t>Controle manual de bilhetes, sorteios e pagamentos</w:t>
+              <w:t xml:space="preserve">Controle manual de bilhetes, </w:t>
+            </w:r>
+            <w:r>
+              <w:lastRenderedPageBreak/>
+              <w:t>sorteios e pagamentos</w:t>
             </w:r>
           </w:p>
         </w:tc>
@@ -2001,7 +2057,12 @@
               <w:spacing w:after="0"/>
             </w:pPr>
             <w:r>
-              <w:t>Organizadores que perdem tempo e correm risco de erros</w:t>
+              <w:lastRenderedPageBreak/>
+              <w:t xml:space="preserve">Organizadores que perdem </w:t>
+            </w:r>
+            <w:r>
+              <w:lastRenderedPageBreak/>
+              <w:t>tempo e correm risco de erros</w:t>
             </w:r>
           </w:p>
         </w:tc>
@@ -2027,11 +2088,12 @@
               <w:spacing w:after="0"/>
             </w:pPr>
             <w:r>
-              <w:t xml:space="preserve">Baixa confiabilidade, falta de transparência e </w:t>
-            </w:r>
-            <w:r>
               <w:lastRenderedPageBreak/>
-              <w:t>dificuldade de escalar</w:t>
+              <w:t xml:space="preserve">Baixa confiabilidade, falta de </w:t>
+            </w:r>
+            <w:r>
+              <w:lastRenderedPageBreak/>
+              <w:t>transparência e dificuldade de escalar</w:t>
             </w:r>
           </w:p>
         </w:tc>
@@ -2058,7 +2120,11 @@
             </w:pPr>
             <w:r>
               <w:lastRenderedPageBreak/>
-              <w:t>Uma plataforma automatizada com gestão completa, pagamentos integrados e sorteios auditáveis</w:t>
+              <w:t xml:space="preserve">Uma plataforma automatizada com gestão completa, pagamentos </w:t>
+            </w:r>
+            <w:r>
+              <w:lastRenderedPageBreak/>
+              <w:t>integrados e sorteios auditáveis</w:t>
             </w:r>
           </w:p>
         </w:tc>
@@ -2798,6 +2864,7 @@
               <w:spacing w:after="0"/>
             </w:pPr>
             <w:r>
+              <w:lastRenderedPageBreak/>
               <w:t>Visitante</w:t>
             </w:r>
           </w:p>
@@ -2907,7 +2974,6 @@
               <w:spacing w:after="0"/>
             </w:pPr>
             <w:r>
-              <w:lastRenderedPageBreak/>
               <w:t>Cliente</w:t>
             </w:r>
           </w:p>
@@ -8410,6 +8476,32 @@
       <w:pPr>
         <w:pStyle w:val="Ttulo2"/>
         <w:spacing w:before="299" w:after="299"/>
+        <w:rPr>
+          <w:rFonts w:ascii="Aptos" w:eastAsia="Aptos" w:hAnsi="Aptos" w:cs="Aptos"/>
+          <w:b/>
+          <w:bCs/>
+          <w:sz w:val="36"/>
+          <w:szCs w:val="36"/>
+        </w:rPr>
+      </w:pPr>
+    </w:p>
+    <w:p>
+      <w:pPr>
+        <w:pStyle w:val="Ttulo2"/>
+        <w:spacing w:before="299" w:after="299"/>
+        <w:rPr>
+          <w:rFonts w:ascii="Aptos" w:eastAsia="Aptos" w:hAnsi="Aptos" w:cs="Aptos"/>
+          <w:b/>
+          <w:bCs/>
+          <w:sz w:val="36"/>
+          <w:szCs w:val="36"/>
+        </w:rPr>
+      </w:pPr>
+    </w:p>
+    <w:p>
+      <w:pPr>
+        <w:pStyle w:val="Ttulo2"/>
+        <w:spacing w:before="299" w:after="299"/>
       </w:pPr>
       <w:r>
         <w:rPr>
@@ -8740,9 +8832,14 @@
             </w:r>
             <w:proofErr w:type="spellStart"/>
             <w:r>
-              <w:t>data_inicio</w:t>
+              <w:t>data_</w:t>
+            </w:r>
+            <w:proofErr w:type="gramStart"/>
+            <w:r>
+              <w:t>inicio</w:t>
             </w:r>
             <w:proofErr w:type="spellEnd"/>
+            <w:proofErr w:type="gramEnd"/>
             <w:r>
               <w:t xml:space="preserve">, data_sorteio, valor_bilhete, </w:t>
             </w:r>
@@ -8813,6 +8910,7 @@
                 <w:b/>
                 <w:bCs/>
               </w:rPr>
+              <w:lastRenderedPageBreak/>
               <w:t>BILHETE</w:t>
             </w:r>
           </w:p>
@@ -8869,7 +8967,15 @@
             </w:r>
             <w:proofErr w:type="spellEnd"/>
             <w:r>
-              <w:t>, numero, status (reservado, pago, cancelado)</w:t>
+              <w:t xml:space="preserve">, </w:t>
+            </w:r>
+            <w:proofErr w:type="spellStart"/>
+            <w:r>
+              <w:t>numero</w:t>
+            </w:r>
+            <w:proofErr w:type="spellEnd"/>
+            <w:r>
+              <w:t>, status (reservado, pago, cancelado)</w:t>
             </w:r>
           </w:p>
         </w:tc>
@@ -8930,7 +9036,6 @@
                 <w:b/>
                 <w:bCs/>
               </w:rPr>
-              <w:lastRenderedPageBreak/>
               <w:t>PAGAMENTO</w:t>
             </w:r>
           </w:p>
@@ -8990,15 +9095,43 @@
             </w:r>
             <w:proofErr w:type="spellEnd"/>
             <w:r>
-              <w:t>, valor, meio (pix/</w:t>
+              <w:t>, valor,</w:t>
+            </w:r>
+            <w:r>
+              <w:t xml:space="preserve"> </w:t>
             </w:r>
             <w:proofErr w:type="spellStart"/>
             <w:r>
+              <w:t>tipo_pagamento</w:t>
+            </w:r>
+            <w:proofErr w:type="spellEnd"/>
+            <w:r>
+              <w:t xml:space="preserve"> </w:t>
+            </w:r>
+            <w:r>
+              <w:t>(pix/</w:t>
+            </w:r>
+            <w:proofErr w:type="spellStart"/>
+            <w:r>
               <w:t>cartao</w:t>
             </w:r>
             <w:proofErr w:type="spellEnd"/>
             <w:r>
-              <w:t>/boleto), status (pendente, pago, falhou), data, transacao_id</w:t>
+              <w:t xml:space="preserve">/boleto), </w:t>
+            </w:r>
+            <w:proofErr w:type="spellStart"/>
+            <w:r>
+              <w:t>status</w:t>
+            </w:r>
+            <w:r>
+              <w:t>_pagamento</w:t>
+            </w:r>
+            <w:proofErr w:type="spellEnd"/>
+            <w:r>
+              <w:t xml:space="preserve"> (pendente, pago, falhou), data</w:t>
+            </w:r>
+            <w:r>
+              <w:t>.</w:t>
             </w:r>
           </w:p>
         </w:tc>
@@ -9107,7 +9240,23 @@
             </w:r>
             <w:proofErr w:type="spellEnd"/>
             <w:r>
-              <w:t>, status_gateway, resposta_gateway, data</w:t>
+              <w:t xml:space="preserve">, </w:t>
+            </w:r>
+            <w:proofErr w:type="spellStart"/>
+            <w:r>
+              <w:t>status_gateway</w:t>
+            </w:r>
+            <w:proofErr w:type="spellEnd"/>
+            <w:r>
+              <w:t xml:space="preserve">, </w:t>
+            </w:r>
+            <w:proofErr w:type="spellStart"/>
+            <w:r>
+              <w:t>resposta_gateway</w:t>
+            </w:r>
+            <w:proofErr w:type="spellEnd"/>
+            <w:r>
+              <w:t>, data</w:t>
             </w:r>
           </w:p>
         </w:tc>
@@ -9347,6 +9496,17 @@
             </w:r>
             <w:proofErr w:type="spellEnd"/>
             <w:r>
+              <w:t>,</w:t>
+            </w:r>
+            <w:r>
+              <w:t xml:space="preserve"> </w:t>
+            </w:r>
+            <w:proofErr w:type="spellStart"/>
+            <w:r>
+              <w:t>bilhete_id</w:t>
+            </w:r>
+            <w:proofErr w:type="spellEnd"/>
+            <w:r>
               <w:t xml:space="preserve">, </w:t>
             </w:r>
             <w:proofErr w:type="spellStart"/>
@@ -9363,7 +9523,17 @@
             </w:r>
             <w:proofErr w:type="spellEnd"/>
             <w:r>
-              <w:t xml:space="preserve"> (manual/auto/loteria), resultado (numero sorteado, id_vencedor)</w:t>
+              <w:t xml:space="preserve"> (manual/auto/loteria), resultado (</w:t>
+            </w:r>
+            <w:proofErr w:type="spellStart"/>
+            <w:proofErr w:type="gramStart"/>
+            <w:r>
+              <w:t>numero</w:t>
+            </w:r>
+            <w:proofErr w:type="spellEnd"/>
+            <w:proofErr w:type="gramEnd"/>
+            <w:r>
+              <w:t xml:space="preserve"> sorteado, id_vencedor)</w:t>
             </w:r>
           </w:p>
         </w:tc>
@@ -9658,6 +9828,7 @@
                 <w:b/>
                 <w:bCs/>
               </w:rPr>
+              <w:lastRenderedPageBreak/>
               <w:t>PAINEL_ADMIN</w:t>
             </w:r>
           </w:p>
@@ -9782,13 +9953,34 @@
             </w:r>
             <w:proofErr w:type="spellEnd"/>
             <w:r>
-              <w:t>, usuario</w:t>
+              <w:t xml:space="preserve">, </w:t>
+            </w:r>
+            <w:proofErr w:type="spellStart"/>
+            <w:r>
+              <w:t>usuario</w:t>
             </w:r>
             <w:r>
               <w:t>_id</w:t>
             </w:r>
-            <w:r>
-              <w:t>, tipo (email/sms), titulo, mensagem, data_envio, status</w:t>
+            <w:proofErr w:type="spellEnd"/>
+            <w:r>
+              <w:t>, tipo (</w:t>
+            </w:r>
+            <w:proofErr w:type="spellStart"/>
+            <w:r>
+              <w:t>email</w:t>
+            </w:r>
+            <w:proofErr w:type="spellEnd"/>
+            <w:r>
+              <w:t>/</w:t>
+            </w:r>
+            <w:proofErr w:type="spellStart"/>
+            <w:r>
+              <w:t>sms</w:t>
+            </w:r>
+            <w:proofErr w:type="spellEnd"/>
+            <w:r>
+              <w:t>), titulo, mensagem, data_envio, status</w:t>
             </w:r>
           </w:p>
         </w:tc>
@@ -9844,7 +10036,6 @@
         <w:rPr>
           <w:rFonts w:ascii="Consolas" w:eastAsia="Consolas" w:hAnsi="Consolas" w:cs="Consolas"/>
         </w:rPr>
-        <w:lastRenderedPageBreak/>
         <w:t>USUARIO ---&lt; BILHETE &gt;--- RIFA</w:t>
       </w:r>
       <w:r>
@@ -10492,6 +10683,7 @@
               <w:spacing w:after="0"/>
             </w:pPr>
             <w:r>
+              <w:lastRenderedPageBreak/>
               <w:t>RN06</w:t>
             </w:r>
           </w:p>
@@ -10733,7 +10925,6 @@
           <w:sz w:val="36"/>
           <w:szCs w:val="36"/>
         </w:rPr>
-        <w:lastRenderedPageBreak/>
         <w:t>8. Matriz de rastreabilidade (exemplo)</w:t>
       </w:r>
     </w:p>
@@ -11849,6 +12040,7 @@
               <w:spacing w:after="0"/>
             </w:pPr>
             <w:r>
+              <w:lastRenderedPageBreak/>
               <w:t>UC03</w:t>
             </w:r>
           </w:p>
@@ -12285,7 +12477,6 @@
               <w:spacing w:after="0"/>
             </w:pPr>
             <w:r>
-              <w:lastRenderedPageBreak/>
               <w:t>UC07</w:t>
             </w:r>
           </w:p>
@@ -12822,6 +13013,7 @@
           <w:b/>
           <w:bCs/>
         </w:rPr>
+        <w:lastRenderedPageBreak/>
         <w:t>Versão 3.0 (futuro)</w:t>
       </w:r>
     </w:p>
@@ -12877,7 +13069,7 @@
 </file>
 
 <file path=word/numbering.xml><?xml version="1.0" encoding="utf-8"?>
-<w:numbering xmlns:wpc="http://schemas.microsoft.com/office/word/2010/wordprocessingCanvas" xmlns:cx="http://schemas.microsoft.com/office/drawing/2014/chartex" xmlns:cx1="http://schemas.microsoft.com/office/drawing/2015/9/8/chartex" xmlns:cx2="http://schemas.microsoft.com/office/drawing/2015/10/21/chartex" xmlns:cx3="http://schemas.microsoft.com/office/drawing/2016/5/9/chartex" xmlns:cx4="http://schemas.microsoft.com/office/drawing/2016/5/10/chartex" xmlns:cx5="http://schemas.microsoft.com/office/drawing/2016/5/11/chartex" xmlns:cx6="http://schemas.microsoft.com/office/drawing/2016/5/12/chartex" xmlns:cx7="http://schemas.microsoft.com/office/drawing/2016/5/13/chartex" xmlns:cx8="http://schemas.microsoft.com/office/drawing/2016/5/14/chartex" xmlns:mc="http://schemas.openxmlformats.org/markup-compatibility/2006" xmlns:aink="http://schemas.microsoft.com/office/drawing/2016/ink" xmlns:am3d="http://schemas.microsoft.com/office/drawing/2017/model3d" xmlns:o="urn:schemas-microsoft-com:office:office" xmlns:oel="http://schemas.microsoft.com/office/2019/extlst" xmlns:r="http://schemas.openxmlformats.org/officeDocument/2006/relationships" xmlns:m="http://schemas.openxmlformats.org/officeDocument/2006/math" xmlns:v="urn:schemas-microsoft-com:vml" xmlns:wp14="http://schemas.microsoft.com/office/word/2010/wordprocessingDrawing" xmlns:wp="http://schemas.openxmlformats.org/drawingml/2006/wordprocessingDrawing" xmlns:w10="urn:schemas-microsoft-com:office:word" xmlns:w="http://schemas.openxmlformats.org/wordprocessingml/2006/main" xmlns:w14="http://schemas.microsoft.com/office/word/2010/wordml" xmlns:w15="http://schemas.microsoft.com/office/word/2012/wordml" xmlns:w16cex="http://schemas.microsoft.com/office/word/2018/wordml/cex" xmlns:w16cid="http://schemas.microsoft.com/office/word/2016/wordml/cid" xmlns:w16="http://schemas.microsoft.com/office/word/2018/wordml" xmlns:w16sdtdh="http://schemas.microsoft.com/office/word/2020/wordml/sdtdatahash" xmlns:w16se="http://schemas.microsoft.com/office/word/2015/wordml/symex" xmlns:wpg="http://schemas.microsoft.com/office/word/2010/wordprocessingGroup" xmlns:wpi="http://schemas.microsoft.com/office/word/2010/wordprocessingInk" xmlns:wne="http://schemas.microsoft.com/office/word/2006/wordml" xmlns:wps="http://schemas.microsoft.com/office/word/2010/wordprocessingShape" mc:Ignorable="w14 w15 w16se w16cid w16 w16cex w16sdtdh wp14">
+<w:numbering xmlns:wpc="http://schemas.microsoft.com/office/word/2010/wordprocessingCanvas" xmlns:cx="http://schemas.microsoft.com/office/drawing/2014/chartex" xmlns:cx1="http://schemas.microsoft.com/office/drawing/2015/9/8/chartex" xmlns:cx2="http://schemas.microsoft.com/office/drawing/2015/10/21/chartex" xmlns:cx3="http://schemas.microsoft.com/office/drawing/2016/5/9/chartex" xmlns:cx4="http://schemas.microsoft.com/office/drawing/2016/5/10/chartex" xmlns:cx5="http://schemas.microsoft.com/office/drawing/2016/5/11/chartex" xmlns:cx6="http://schemas.microsoft.com/office/drawing/2016/5/12/chartex" xmlns:cx7="http://schemas.microsoft.com/office/drawing/2016/5/13/chartex" xmlns:cx8="http://schemas.microsoft.com/office/drawing/2016/5/14/chartex" xmlns:mc="http://schemas.openxmlformats.org/markup-compatibility/2006" xmlns:aink="http://schemas.microsoft.com/office/drawing/2016/ink" xmlns:am3d="http://schemas.microsoft.com/office/drawing/2017/model3d" xmlns:o="urn:schemas-microsoft-com:office:office" xmlns:oel="http://schemas.microsoft.com/office/2019/extlst" xmlns:r="http://schemas.openxmlformats.org/officeDocument/2006/relationships" xmlns:m="http://schemas.openxmlformats.org/officeDocument/2006/math" xmlns:v="urn:schemas-microsoft-com:vml" xmlns:wp14="http://schemas.microsoft.com/office/word/2010/wordprocessingDrawing" xmlns:wp="http://schemas.openxmlformats.org/drawingml/2006/wordprocessingDrawing" xmlns:w10="urn:schemas-microsoft-com:office:word" xmlns:w="http://schemas.openxmlformats.org/wordprocessingml/2006/main" xmlns:w14="http://schemas.microsoft.com/office/word/2010/wordml" xmlns:w15="http://schemas.microsoft.com/office/word/2012/wordml" xmlns:w16cex="http://schemas.microsoft.com/office/word/2018/wordml/cex" xmlns:w16cid="http://schemas.microsoft.com/office/word/2016/wordml/cid" xmlns:w16="http://schemas.microsoft.com/office/word/2018/wordml" xmlns:w16du="http://schemas.microsoft.com/office/word/2023/wordml/word16du" xmlns:w16sdtdh="http://schemas.microsoft.com/office/word/2020/wordml/sdtdatahash" xmlns:w16sdtfl="http://schemas.microsoft.com/office/word/2024/wordml/sdtformatlock" xmlns:w16se="http://schemas.microsoft.com/office/word/2015/wordml/symex" xmlns:wpg="http://schemas.microsoft.com/office/word/2010/wordprocessingGroup" xmlns:wpi="http://schemas.microsoft.com/office/word/2010/wordprocessingInk" xmlns:wne="http://schemas.microsoft.com/office/word/2006/wordml" xmlns:wps="http://schemas.microsoft.com/office/word/2010/wordprocessingShape" mc:Ignorable="w14 w15 w16se w16cid w16 w16cex w16sdtdh w16sdtfl w16du wp14">
   <w:abstractNum w:abstractNumId="0" w15:restartNumberingAfterBreak="0">
     <w:nsid w:val="0AF94FB6"/>
     <w:multiLevelType w:val="hybridMultilevel"/>
@@ -13551,7 +13743,7 @@
 </file>
 
 <file path=word/styles.xml><?xml version="1.0" encoding="utf-8"?>
-<w:styles xmlns:mc="http://schemas.openxmlformats.org/markup-compatibility/2006" xmlns:r="http://schemas.openxmlformats.org/officeDocument/2006/relationships" xmlns:w="http://schemas.openxmlformats.org/wordprocessingml/2006/main" xmlns:w14="http://schemas.microsoft.com/office/word/2010/wordml" xmlns:w15="http://schemas.microsoft.com/office/word/2012/wordml" xmlns:w16cex="http://schemas.microsoft.com/office/word/2018/wordml/cex" xmlns:w16cid="http://schemas.microsoft.com/office/word/2016/wordml/cid" xmlns:w16="http://schemas.microsoft.com/office/word/2018/wordml" xmlns:w16sdtdh="http://schemas.microsoft.com/office/word/2020/wordml/sdtdatahash" xmlns:w16se="http://schemas.microsoft.com/office/word/2015/wordml/symex" mc:Ignorable="w14 w15 w16se w16cid w16 w16cex w16sdtdh">
+<w:styles xmlns:mc="http://schemas.openxmlformats.org/markup-compatibility/2006" xmlns:r="http://schemas.openxmlformats.org/officeDocument/2006/relationships" xmlns:w="http://schemas.openxmlformats.org/wordprocessingml/2006/main" xmlns:w14="http://schemas.microsoft.com/office/word/2010/wordml" xmlns:w15="http://schemas.microsoft.com/office/word/2012/wordml" xmlns:w16cex="http://schemas.microsoft.com/office/word/2018/wordml/cex" xmlns:w16cid="http://schemas.microsoft.com/office/word/2016/wordml/cid" xmlns:w16="http://schemas.microsoft.com/office/word/2018/wordml" xmlns:w16du="http://schemas.microsoft.com/office/word/2023/wordml/word16du" xmlns:w16sdtdh="http://schemas.microsoft.com/office/word/2020/wordml/sdtdatahash" xmlns:w16sdtfl="http://schemas.microsoft.com/office/word/2024/wordml/sdtformatlock" xmlns:w16se="http://schemas.microsoft.com/office/word/2015/wordml/symex" mc:Ignorable="w14 w15 w16se w16cid w16 w16cex w16sdtdh w16sdtfl w16du">
   <w:docDefaults>
     <w:rPrDefault>
       <w:rPr>

</xml_diff>

<commit_message>
Update requirements docx and add temp file
Updated Documento de Visão e Especificação de Requisitos.docx (binary change). Also added a Word temporary file Documentação/~WRL4100.tmp — likely an accidental editor temp file. Consider removing the temp file and adding a .gitignore rule to exclude Word temporary files (~WRL*.tmp).
</commit_message>
<xml_diff>
--- a/Documentação/Documento de Visão e Especificação de Requisitos.docx
+++ b/Documentação/Documento de Visão e Especificação de Requisitos.docx
@@ -1,23 +1,7 @@
 
 <file path=word/document.xml><?xml version="1.0" encoding="utf-8"?>
-<w:document xmlns:wpc="http://schemas.microsoft.com/office/word/2010/wordprocessingCanvas" xmlns:cx="http://schemas.microsoft.com/office/drawing/2014/chartex" xmlns:cx1="http://schemas.microsoft.com/office/drawing/2015/9/8/chartex" xmlns:cx2="http://schemas.microsoft.com/office/drawing/2015/10/21/chartex" xmlns:cx3="http://schemas.microsoft.com/office/drawing/2016/5/9/chartex" xmlns:cx4="http://schemas.microsoft.com/office/drawing/2016/5/10/chartex" xmlns:cx5="http://schemas.microsoft.com/office/drawing/2016/5/11/chartex" xmlns:cx6="http://schemas.microsoft.com/office/drawing/2016/5/12/chartex" xmlns:cx7="http://schemas.microsoft.com/office/drawing/2016/5/13/chartex" xmlns:cx8="http://schemas.microsoft.com/office/drawing/2016/5/14/chartex" xmlns:mc="http://schemas.openxmlformats.org/markup-compatibility/2006" xmlns:aink="http://schemas.microsoft.com/office/drawing/2016/ink" xmlns:am3d="http://schemas.microsoft.com/office/drawing/2017/model3d" xmlns:o="urn:schemas-microsoft-com:office:office" xmlns:oel="http://schemas.microsoft.com/office/2019/extlst" xmlns:r="http://schemas.openxmlformats.org/officeDocument/2006/relationships" xmlns:m="http://schemas.openxmlformats.org/officeDocument/2006/math" xmlns:v="urn:schemas-microsoft-com:vml" xmlns:wp14="http://schemas.microsoft.com/office/word/2010/wordprocessingDrawing" xmlns:wp="http://schemas.openxmlformats.org/drawingml/2006/wordprocessingDrawing" xmlns:w10="urn:schemas-microsoft-com:office:word" xmlns:w="http://schemas.openxmlformats.org/wordprocessingml/2006/main" xmlns:w14="http://schemas.microsoft.com/office/word/2010/wordml" xmlns:w15="http://schemas.microsoft.com/office/word/2012/wordml" xmlns:w16cex="http://schemas.microsoft.com/office/word/2018/wordml/cex" xmlns:w16cid="http://schemas.microsoft.com/office/word/2016/wordml/cid" xmlns:w16="http://schemas.microsoft.com/office/word/2018/wordml" xmlns:w16du="http://schemas.microsoft.com/office/word/2023/wordml/word16du" xmlns:w16sdtdh="http://schemas.microsoft.com/office/word/2020/wordml/sdtdatahash" xmlns:w16sdtfl="http://schemas.microsoft.com/office/word/2024/wordml/sdtformatlock" xmlns:w16se="http://schemas.microsoft.com/office/word/2015/wordml/symex" xmlns:wpg="http://schemas.microsoft.com/office/word/2010/wordprocessingGroup" xmlns:wpi="http://schemas.microsoft.com/office/word/2010/wordprocessingInk" xmlns:wne="http://schemas.microsoft.com/office/word/2006/wordml" xmlns:wps="http://schemas.microsoft.com/office/word/2010/wordprocessingShape" mc:Ignorable="w14 w15 w16se w16cid w16 w16cex w16sdtdh w16sdtfl w16du wp14">
+<w:document xmlns:wpc="http://schemas.microsoft.com/office/word/2010/wordprocessingCanvas" xmlns:cx="http://schemas.microsoft.com/office/drawing/2014/chartex" xmlns:cx1="http://schemas.microsoft.com/office/drawing/2015/9/8/chartex" xmlns:cx2="http://schemas.microsoft.com/office/drawing/2015/10/21/chartex" xmlns:cx3="http://schemas.microsoft.com/office/drawing/2016/5/9/chartex" xmlns:cx4="http://schemas.microsoft.com/office/drawing/2016/5/10/chartex" xmlns:cx5="http://schemas.microsoft.com/office/drawing/2016/5/11/chartex" xmlns:cx6="http://schemas.microsoft.com/office/drawing/2016/5/12/chartex" xmlns:cx7="http://schemas.microsoft.com/office/drawing/2016/5/13/chartex" xmlns:cx8="http://schemas.microsoft.com/office/drawing/2016/5/14/chartex" xmlns:mc="http://schemas.openxmlformats.org/markup-compatibility/2006" xmlns:aink="http://schemas.microsoft.com/office/drawing/2016/ink" xmlns:am3d="http://schemas.microsoft.com/office/drawing/2017/model3d" xmlns:o="urn:schemas-microsoft-com:office:office" xmlns:oel="http://schemas.microsoft.com/office/2019/extlst" xmlns:r="http://schemas.openxmlformats.org/officeDocument/2006/relationships" xmlns:m="http://schemas.openxmlformats.org/officeDocument/2006/math" xmlns:v="urn:schemas-microsoft-com:vml" xmlns:wp14="http://schemas.microsoft.com/office/word/2010/wordprocessingDrawing" xmlns:wp="http://schemas.openxmlformats.org/drawingml/2006/wordprocessingDrawing" xmlns:w10="urn:schemas-microsoft-com:office:word" xmlns:w="http://schemas.openxmlformats.org/wordprocessingml/2006/main" xmlns:w14="http://schemas.microsoft.com/office/word/2010/wordml" xmlns:w15="http://schemas.microsoft.com/office/word/2012/wordml" xmlns:w16cex="http://schemas.microsoft.com/office/word/2018/wordml/cex" xmlns:w16cid="http://schemas.microsoft.com/office/word/2016/wordml/cid" xmlns:w16="http://schemas.microsoft.com/office/word/2018/wordml" xmlns:w16sdtdh="http://schemas.microsoft.com/office/word/2020/wordml/sdtdatahash" xmlns:w16se="http://schemas.microsoft.com/office/word/2015/wordml/symex" xmlns:wpg="http://schemas.microsoft.com/office/word/2010/wordprocessingGroup" xmlns:wpi="http://schemas.microsoft.com/office/word/2010/wordprocessingInk" xmlns:wne="http://schemas.microsoft.com/office/word/2006/wordml" xmlns:wps="http://schemas.microsoft.com/office/word/2010/wordprocessingShape" mc:Ignorable="w14 w15 w16se w16cid w16 w16cex w16sdtdh wp14">
   <w:body>
-    <w:p>
-      <w:pPr>
-        <w:pStyle w:val="Ttulo1"/>
-        <w:spacing w:before="322" w:after="322"/>
-      </w:pPr>
-      <w:r>
-        <w:rPr>
-          <w:rFonts w:ascii="Aptos" w:eastAsia="Aptos" w:hAnsi="Aptos" w:cs="Aptos"/>
-          <w:b/>
-          <w:bCs/>
-          <w:sz w:val="48"/>
-          <w:szCs w:val="48"/>
-        </w:rPr>
-        <w:t>Documento de Visão e Especificação de Requisitos</w:t>
-      </w:r>
-    </w:p>
     <w:p>
       <w:pPr>
         <w:pStyle w:val="Ttulo2"/>
@@ -50,7 +34,13 @@
         <w:rPr>
           <w:rFonts w:ascii="Aptos" w:eastAsia="Aptos" w:hAnsi="Aptos" w:cs="Aptos"/>
         </w:rPr>
-        <w:t xml:space="preserve"> 1.0</w:t>
+        <w:t xml:space="preserve"> 1.</w:t>
+      </w:r>
+      <w:r>
+        <w:rPr>
+          <w:rFonts w:ascii="Aptos" w:eastAsia="Aptos" w:hAnsi="Aptos" w:cs="Aptos"/>
+        </w:rPr>
+        <w:t>1</w:t>
       </w:r>
     </w:p>
     <w:p>
@@ -467,15 +457,7 @@
               <w:spacing w:after="0"/>
             </w:pPr>
             <w:r>
-              <w:t xml:space="preserve">Modificações dos nomes </w:t>
-            </w:r>
-            <w:proofErr w:type="gramStart"/>
-            <w:r>
-              <w:t>das ids</w:t>
-            </w:r>
-            <w:proofErr w:type="gramEnd"/>
-            <w:r>
-              <w:t xml:space="preserve"> e adicionado mais um atributo no sorteio o </w:t>
+              <w:t xml:space="preserve">Modificações dos nomes das ids e adicionado mais um atributo no sorteio o </w:t>
             </w:r>
             <w:proofErr w:type="spellStart"/>
             <w:r>
@@ -515,7 +497,7 @@
           <w:rFonts w:ascii="Aptos" w:eastAsia="Aptos" w:hAnsi="Aptos" w:cs="Aptos"/>
         </w:rPr>
       </w:pPr>
-      <w:hyperlink r:id="rId5" w:anchor="1-introdu%C3%A7%C3%A3o">
+      <w:hyperlink r:id="rId6" w:anchor="1-introdu%C3%A7%C3%A3o">
         <w:r>
           <w:rPr>
             <w:rStyle w:val="Hyperlink"/>
@@ -542,7 +524,7 @@
         </w:rPr>
         <w:t xml:space="preserve">1.1 </w:t>
       </w:r>
-      <w:hyperlink r:id="rId6" w:anchor="11-prop%C3%B3sito">
+      <w:hyperlink r:id="rId7" w:anchor="11-prop%C3%B3sito">
         <w:r>
           <w:rPr>
             <w:rStyle w:val="Hyperlink"/>
@@ -569,7 +551,7 @@
         </w:rPr>
         <w:t xml:space="preserve">1.2 </w:t>
       </w:r>
-      <w:hyperlink r:id="rId7" w:anchor="12-escopo">
+      <w:hyperlink r:id="rId8" w:anchor="12-escopo">
         <w:r>
           <w:rPr>
             <w:rStyle w:val="Hyperlink"/>
@@ -596,7 +578,7 @@
         </w:rPr>
         <w:t xml:space="preserve">1.3 </w:t>
       </w:r>
-      <w:hyperlink r:id="rId8" w:anchor="13-defini%C3%A7%C3%B5es-acr%C3%B4nimos-e-abrevia%C3%A7%C3%B5es">
+      <w:hyperlink r:id="rId9" w:anchor="13-defini%C3%A7%C3%B5es-acr%C3%B4nimos-e-abrevia%C3%A7%C3%B5es">
         <w:r>
           <w:rPr>
             <w:rStyle w:val="Hyperlink"/>
@@ -624,7 +606,7 @@
           <w:rFonts w:ascii="Aptos" w:eastAsia="Aptos" w:hAnsi="Aptos" w:cs="Aptos"/>
         </w:rPr>
       </w:pPr>
-      <w:hyperlink r:id="rId9" w:anchor="2-posicionamento">
+      <w:hyperlink r:id="rId10" w:anchor="2-posicionamento">
         <w:r>
           <w:rPr>
             <w:rStyle w:val="Hyperlink"/>
@@ -645,7 +627,7 @@
         </w:rPr>
         <w:t xml:space="preserve">2.1 </w:t>
       </w:r>
-      <w:hyperlink r:id="rId10" w:anchor="21-oportunidade-de-neg%C3%B3cio">
+      <w:hyperlink r:id="rId11" w:anchor="21-oportunidade-de-neg%C3%B3cio">
         <w:r>
           <w:rPr>
             <w:rStyle w:val="Hyperlink"/>
@@ -666,7 +648,7 @@
         </w:rPr>
         <w:t xml:space="preserve">2.2 </w:t>
       </w:r>
-      <w:hyperlink r:id="rId11" w:anchor="22-descri%C3%A7%C3%A3o-do-problema">
+      <w:hyperlink r:id="rId12" w:anchor="22-descri%C3%A7%C3%A3o-do-problema">
         <w:r>
           <w:rPr>
             <w:rStyle w:val="Hyperlink"/>
@@ -685,10 +667,9 @@
         <w:rPr>
           <w:rFonts w:ascii="Aptos" w:eastAsia="Aptos" w:hAnsi="Aptos" w:cs="Aptos"/>
         </w:rPr>
-        <w:lastRenderedPageBreak/>
         <w:t xml:space="preserve">2.3 </w:t>
       </w:r>
-      <w:hyperlink r:id="rId12" w:anchor="23-descri%C3%A7%C3%A3o-da-solu%C3%A7%C3%A3o">
+      <w:hyperlink r:id="rId13" w:anchor="23-descri%C3%A7%C3%A3o-da-solu%C3%A7%C3%A3o">
         <w:r>
           <w:rPr>
             <w:rStyle w:val="Hyperlink"/>
@@ -716,7 +697,7 @@
           <w:rFonts w:ascii="Aptos" w:eastAsia="Aptos" w:hAnsi="Aptos" w:cs="Aptos"/>
         </w:rPr>
       </w:pPr>
-      <w:hyperlink r:id="rId13" w:anchor="3-stakeholders-e-usu%C3%A1rios">
+      <w:hyperlink r:id="rId14" w:anchor="3-stakeholders-e-usu%C3%A1rios">
         <w:r>
           <w:rPr>
             <w:rStyle w:val="Hyperlink"/>
@@ -737,7 +718,7 @@
         </w:rPr>
         <w:t xml:space="preserve">3.1 </w:t>
       </w:r>
-      <w:hyperlink r:id="rId14" w:anchor="31-stakeholders">
+      <w:hyperlink r:id="rId15" w:anchor="31-stakeholders">
         <w:r>
           <w:rPr>
             <w:rStyle w:val="Hyperlink"/>
@@ -758,7 +739,7 @@
         </w:rPr>
         <w:t xml:space="preserve">3.2 </w:t>
       </w:r>
-      <w:hyperlink r:id="rId15" w:anchor="32-perfis-de-usu%C3%A1rio">
+      <w:hyperlink r:id="rId16" w:anchor="32-perfis-de-usu%C3%A1rio">
         <w:r>
           <w:rPr>
             <w:rStyle w:val="Hyperlink"/>
@@ -786,7 +767,7 @@
           <w:rFonts w:ascii="Aptos" w:eastAsia="Aptos" w:hAnsi="Aptos" w:cs="Aptos"/>
         </w:rPr>
       </w:pPr>
-      <w:hyperlink r:id="rId16" w:anchor="4-requisitos-funcionais">
+      <w:hyperlink r:id="rId17" w:anchor="4-requisitos-funcionais">
         <w:r>
           <w:rPr>
             <w:rStyle w:val="Hyperlink"/>
@@ -805,9 +786,10 @@
         <w:rPr>
           <w:rFonts w:ascii="Aptos" w:eastAsia="Aptos" w:hAnsi="Aptos" w:cs="Aptos"/>
         </w:rPr>
+        <w:lastRenderedPageBreak/>
         <w:t xml:space="preserve">4.1 </w:t>
       </w:r>
-      <w:hyperlink r:id="rId17" w:anchor="41-m%C3%B3dulo-p%C3%BAblico-e-cliente">
+      <w:hyperlink r:id="rId18" w:anchor="41-m%C3%B3dulo-p%C3%BAblico-e-cliente">
         <w:r>
           <w:rPr>
             <w:rStyle w:val="Hyperlink"/>
@@ -828,7 +810,7 @@
         </w:rPr>
         <w:t xml:space="preserve">4.2 </w:t>
       </w:r>
-      <w:hyperlink r:id="rId18" w:anchor="42-m%C3%B3dulo-administrativo">
+      <w:hyperlink r:id="rId19" w:anchor="42-m%C3%B3dulo-administrativo">
         <w:r>
           <w:rPr>
             <w:rStyle w:val="Hyperlink"/>
@@ -849,7 +831,7 @@
         </w:rPr>
         <w:t xml:space="preserve">4.3 </w:t>
       </w:r>
-      <w:hyperlink r:id="rId19" w:anchor="43-integra%C3%A7%C3%B5es">
+      <w:hyperlink r:id="rId20" w:anchor="43-integra%C3%A7%C3%B5es">
         <w:r>
           <w:rPr>
             <w:rStyle w:val="Hyperlink"/>
@@ -877,7 +859,7 @@
           <w:rFonts w:ascii="Aptos" w:eastAsia="Aptos" w:hAnsi="Aptos" w:cs="Aptos"/>
         </w:rPr>
       </w:pPr>
-      <w:hyperlink r:id="rId20" w:anchor="5-requisitos-n%C3%A3o-funcionais">
+      <w:hyperlink r:id="rId21" w:anchor="5-requisitos-n%C3%A3o-funcionais">
         <w:r>
           <w:rPr>
             <w:rStyle w:val="Hyperlink"/>
@@ -905,7 +887,7 @@
           <w:rFonts w:ascii="Aptos" w:eastAsia="Aptos" w:hAnsi="Aptos" w:cs="Aptos"/>
         </w:rPr>
       </w:pPr>
-      <w:hyperlink r:id="rId21" w:anchor="6-modelo-de-dados-entidades-e-relacionamentos">
+      <w:hyperlink r:id="rId22" w:anchor="6-modelo-de-dados-entidades-e-relacionamentos">
         <w:r>
           <w:rPr>
             <w:rStyle w:val="Hyperlink"/>
@@ -933,7 +915,7 @@
           <w:rFonts w:ascii="Aptos" w:eastAsia="Aptos" w:hAnsi="Aptos" w:cs="Aptos"/>
         </w:rPr>
       </w:pPr>
-      <w:hyperlink r:id="rId22" w:anchor="7-regras-de-neg%C3%B3cio">
+      <w:hyperlink r:id="rId23" w:anchor="7-regras-de-neg%C3%B3cio">
         <w:r>
           <w:rPr>
             <w:rStyle w:val="Hyperlink"/>
@@ -961,7 +943,7 @@
           <w:rFonts w:ascii="Aptos" w:eastAsia="Aptos" w:hAnsi="Aptos" w:cs="Aptos"/>
         </w:rPr>
       </w:pPr>
-      <w:hyperlink r:id="rId23" w:anchor="8-matriz-de-rastreabilidade">
+      <w:hyperlink r:id="rId24" w:anchor="8-matriz-de-rastreabilidade">
         <w:r>
           <w:rPr>
             <w:rStyle w:val="Hyperlink"/>
@@ -989,7 +971,7 @@
           <w:rFonts w:ascii="Aptos" w:eastAsia="Aptos" w:hAnsi="Aptos" w:cs="Aptos"/>
         </w:rPr>
       </w:pPr>
-      <w:hyperlink r:id="rId24" w:anchor="9-casos-de-uso-vis%C3%A3o-geral">
+      <w:hyperlink r:id="rId25" w:anchor="9-casos-de-uso-vis%C3%A3o-geral">
         <w:r>
           <w:rPr>
             <w:rStyle w:val="Hyperlink"/>
@@ -1017,7 +999,7 @@
           <w:rFonts w:ascii="Aptos" w:eastAsia="Aptos" w:hAnsi="Aptos" w:cs="Aptos"/>
         </w:rPr>
       </w:pPr>
-      <w:hyperlink r:id="rId25" w:anchor="10-prioriza%C3%A7%C3%A3o-mvp">
+      <w:hyperlink r:id="rId26" w:anchor="10-prioriza%C3%A7%C3%A3o-mvp">
         <w:r>
           <w:rPr>
             <w:rStyle w:val="Hyperlink"/>
@@ -1045,7 +1027,7 @@
           <w:rFonts w:ascii="Aptos" w:eastAsia="Aptos" w:hAnsi="Aptos" w:cs="Aptos"/>
         </w:rPr>
       </w:pPr>
-      <w:hyperlink r:id="rId26" w:anchor="11-riscos-e-mitiga%C3%A7%C3%A3o">
+      <w:hyperlink r:id="rId27" w:anchor="11-riscos-e-mitiga%C3%A7%C3%A3o">
         <w:r>
           <w:rPr>
             <w:rStyle w:val="Hyperlink"/>
@@ -1073,7 +1055,7 @@
           <w:rFonts w:ascii="Aptos" w:eastAsia="Aptos" w:hAnsi="Aptos" w:cs="Aptos"/>
         </w:rPr>
       </w:pPr>
-      <w:hyperlink r:id="rId27" w:anchor="12-aprova%C3%A7%C3%A3o">
+      <w:hyperlink r:id="rId28" w:anchor="12-aprova%C3%A7%C3%A3o">
         <w:r>
           <w:rPr>
             <w:rStyle w:val="Hyperlink"/>
@@ -1299,7 +1281,6 @@
         <w:rPr>
           <w:rFonts w:ascii="Aptos" w:eastAsia="Aptos" w:hAnsi="Aptos" w:cs="Aptos"/>
         </w:rPr>
-        <w:lastRenderedPageBreak/>
         <w:t>Relatórios gerenciais em PDF/Excel.</w:t>
       </w:r>
     </w:p>
@@ -1425,6 +1406,7 @@
               <w:spacing w:after="0"/>
             </w:pPr>
             <w:r>
+              <w:lastRenderedPageBreak/>
               <w:t>Rifa</w:t>
             </w:r>
           </w:p>
@@ -2027,11 +2009,7 @@
               <w:spacing w:after="0"/>
             </w:pPr>
             <w:r>
-              <w:t xml:space="preserve">Controle manual de bilhetes, </w:t>
-            </w:r>
-            <w:r>
-              <w:lastRenderedPageBreak/>
-              <w:t>sorteios e pagamentos</w:t>
+              <w:t>Controle manual de bilhetes, sorteios e pagamentos</w:t>
             </w:r>
           </w:p>
         </w:tc>
@@ -2057,12 +2035,7 @@
               <w:spacing w:after="0"/>
             </w:pPr>
             <w:r>
-              <w:lastRenderedPageBreak/>
-              <w:t xml:space="preserve">Organizadores que perdem </w:t>
-            </w:r>
-            <w:r>
-              <w:lastRenderedPageBreak/>
-              <w:t>tempo e correm risco de erros</w:t>
+              <w:t>Organizadores que perdem tempo e correm risco de erros</w:t>
             </w:r>
           </w:p>
         </w:tc>
@@ -2088,12 +2061,7 @@
               <w:spacing w:after="0"/>
             </w:pPr>
             <w:r>
-              <w:lastRenderedPageBreak/>
-              <w:t xml:space="preserve">Baixa confiabilidade, falta de </w:t>
-            </w:r>
-            <w:r>
-              <w:lastRenderedPageBreak/>
-              <w:t>transparência e dificuldade de escalar</w:t>
+              <w:t>Baixa confiabilidade, falta de transparência e dificuldade de escalar</w:t>
             </w:r>
           </w:p>
         </w:tc>
@@ -2119,12 +2087,7 @@
               <w:spacing w:after="0"/>
             </w:pPr>
             <w:r>
-              <w:lastRenderedPageBreak/>
-              <w:t xml:space="preserve">Uma plataforma automatizada com gestão completa, pagamentos </w:t>
-            </w:r>
-            <w:r>
-              <w:lastRenderedPageBreak/>
-              <w:t>integrados e sorteios auditáveis</w:t>
+              <w:t>Uma plataforma automatizada com gestão completa, pagamentos integrados e sorteios auditáveis</w:t>
             </w:r>
           </w:p>
         </w:tc>
@@ -2141,6 +2104,7 @@
           <w:b/>
           <w:bCs/>
         </w:rPr>
+        <w:lastRenderedPageBreak/>
         <w:t>2.3 Descrição da solução</w:t>
       </w:r>
     </w:p>
@@ -2864,7 +2828,6 @@
               <w:spacing w:after="0"/>
             </w:pPr>
             <w:r>
-              <w:lastRenderedPageBreak/>
               <w:t>Visitante</w:t>
             </w:r>
           </w:p>
@@ -3083,6 +3046,7 @@
               <w:spacing w:after="0"/>
             </w:pPr>
             <w:r>
+              <w:lastRenderedPageBreak/>
               <w:t>Administrador</w:t>
             </w:r>
           </w:p>
@@ -4133,7 +4097,6 @@
               <w:spacing w:after="0"/>
             </w:pPr>
             <w:r>
-              <w:lastRenderedPageBreak/>
               <w:t>RF08</w:t>
             </w:r>
           </w:p>
@@ -4243,6 +4206,7 @@
               <w:spacing w:after="0"/>
             </w:pPr>
             <w:r>
+              <w:lastRenderedPageBreak/>
               <w:t>RF09</w:t>
             </w:r>
           </w:p>
@@ -5385,7 +5349,6 @@
               <w:spacing w:after="0"/>
             </w:pPr>
             <w:r>
-              <w:lastRenderedPageBreak/>
               <w:t>RF18</w:t>
             </w:r>
           </w:p>
@@ -5604,6 +5567,7 @@
               <w:spacing w:after="0"/>
             </w:pPr>
             <w:r>
+              <w:lastRenderedPageBreak/>
               <w:t>RF20</w:t>
             </w:r>
           </w:p>
@@ -8603,7 +8567,7 @@
                 <w:b/>
                 <w:bCs/>
               </w:rPr>
-              <w:t>Atributos principais</w:t>
+              <w:t xml:space="preserve">Atributos </w:t>
             </w:r>
           </w:p>
         </w:tc>
@@ -8748,7 +8712,10 @@
               <w:spacing w:after="0"/>
             </w:pPr>
             <w:r>
-              <w:t>1:N com BILHETE, 1:N com PAGAMENTO, 1:N com HISTORICO_COMPRAS</w:t>
+              <w:t>0</w:t>
+            </w:r>
+            <w:r>
+              <w:t>:N com BILHETE, 1:N com PAGAMENTO, 1:N com HISTORICO_COMPRAS</w:t>
             </w:r>
           </w:p>
         </w:tc>
@@ -8832,24 +8799,11 @@
             </w:r>
             <w:proofErr w:type="spellStart"/>
             <w:r>
-              <w:t>data_</w:t>
-            </w:r>
-            <w:proofErr w:type="gramStart"/>
-            <w:r>
-              <w:t>inicio</w:t>
+              <w:t>data_inicio</w:t>
             </w:r>
             <w:proofErr w:type="spellEnd"/>
-            <w:proofErr w:type="gramEnd"/>
-            <w:r>
-              <w:t xml:space="preserve">, data_sorteio, valor_bilhete, </w:t>
-            </w:r>
-            <w:proofErr w:type="gramStart"/>
-            <w:r>
-              <w:t>premio</w:t>
-            </w:r>
-            <w:proofErr w:type="gramEnd"/>
-            <w:r>
-              <w:t>, total_numeros, status (ativa, encerrada)</w:t>
+            <w:r>
+              <w:t>, data_sorteio, valor_bilhete, premio, total_numeros, status (ativa, encerrada)</w:t>
             </w:r>
           </w:p>
         </w:tc>
@@ -9526,12 +9480,10 @@
               <w:t xml:space="preserve"> (manual/auto/loteria), resultado (</w:t>
             </w:r>
             <w:proofErr w:type="spellStart"/>
-            <w:proofErr w:type="gramStart"/>
             <w:r>
               <w:t>numero</w:t>
             </w:r>
             <w:proofErr w:type="spellEnd"/>
-            <w:proofErr w:type="gramEnd"/>
             <w:r>
               <w:t xml:space="preserve"> sorteado, id_vencedor)</w:t>
             </w:r>
@@ -9854,9 +9806,48 @@
             <w:pPr>
               <w:spacing w:after="0"/>
             </w:pPr>
-            <w:r>
-              <w:t>(entidade lógica, relacionada a permissões)</w:t>
-            </w:r>
+            <w:proofErr w:type="spellStart"/>
+            <w:r>
+              <w:t>Id_paniel_admin</w:t>
+            </w:r>
+            <w:proofErr w:type="spellEnd"/>
+            <w:r>
+              <w:t xml:space="preserve">, </w:t>
+            </w:r>
+            <w:proofErr w:type="spellStart"/>
+            <w:r>
+              <w:t>sorteio_id</w:t>
+            </w:r>
+            <w:proofErr w:type="spellEnd"/>
+            <w:r>
+              <w:t xml:space="preserve">, </w:t>
+            </w:r>
+            <w:proofErr w:type="spellStart"/>
+            <w:r>
+              <w:t>rifa_id</w:t>
+            </w:r>
+            <w:proofErr w:type="spellEnd"/>
+            <w:r>
+              <w:t xml:space="preserve">, </w:t>
+            </w:r>
+            <w:proofErr w:type="spellStart"/>
+            <w:r>
+              <w:t>pargamento_id</w:t>
+            </w:r>
+            <w:proofErr w:type="spellEnd"/>
+            <w:r>
+              <w:t xml:space="preserve">, </w:t>
+            </w:r>
+            <w:proofErr w:type="spellStart"/>
+            <w:r>
+              <w:t>resultado_sorteio_id</w:t>
+            </w:r>
+            <w:proofErr w:type="spellEnd"/>
+          </w:p>
+          <w:p>
+            <w:pPr>
+              <w:spacing w:after="0"/>
+            </w:pPr>
           </w:p>
         </w:tc>
         <w:tc>
@@ -10014,93 +10005,337 @@
     </w:tbl>
     <w:p>
       <w:pPr>
-        <w:spacing w:before="240" w:after="240"/>
-      </w:pPr>
-      <w:r>
+        <w:pStyle w:val="Ttulo2"/>
+        <w:spacing w:before="299" w:after="299"/>
         <w:rPr>
           <w:rFonts w:ascii="Aptos" w:eastAsia="Aptos" w:hAnsi="Aptos" w:cs="Aptos"/>
           <w:b/>
           <w:bCs/>
-        </w:rPr>
-        <w:t>Diagrama de relacionamento resumido:</w:t>
+          <w:sz w:val="36"/>
+          <w:szCs w:val="36"/>
+        </w:rPr>
+      </w:pPr>
+      <w:r>
+        <w:br/>
       </w:r>
       <w:r>
         <w:rPr>
           <w:rFonts w:ascii="Aptos" w:eastAsia="Aptos" w:hAnsi="Aptos" w:cs="Aptos"/>
         </w:rPr>
         <w:t xml:space="preserve"> </w:t>
+      </w:r>
+      <w:r>
+        <w:rPr>
+          <w:rFonts w:ascii="Aptos" w:eastAsia="Aptos" w:hAnsi="Aptos" w:cs="Aptos"/>
+          <w:b/>
+          <w:bCs/>
+          <w:sz w:val="36"/>
+          <w:szCs w:val="36"/>
+        </w:rPr>
+        <w:t>7</w:t>
+      </w:r>
+      <w:r>
+        <w:rPr>
+          <w:rFonts w:ascii="Aptos" w:eastAsia="Aptos" w:hAnsi="Aptos" w:cs="Aptos"/>
+          <w:b/>
+          <w:bCs/>
+          <w:sz w:val="36"/>
+          <w:szCs w:val="36"/>
+        </w:rPr>
+        <w:t>.</w:t>
+      </w:r>
+      <w:r>
+        <w:rPr>
+          <w:rFonts w:ascii="Aptos" w:eastAsia="Aptos" w:hAnsi="Aptos" w:cs="Aptos"/>
+          <w:b/>
+          <w:bCs/>
+          <w:sz w:val="36"/>
+          <w:szCs w:val="36"/>
+        </w:rPr>
+        <w:t xml:space="preserve"> </w:t>
+      </w:r>
+      <w:r>
+        <w:rPr>
+          <w:rFonts w:ascii="Aptos" w:eastAsia="Aptos" w:hAnsi="Aptos" w:cs="Aptos"/>
+          <w:b/>
+          <w:bCs/>
+          <w:sz w:val="36"/>
+          <w:szCs w:val="36"/>
+        </w:rPr>
+        <w:t>Dicionário de Dados</w:t>
+      </w:r>
+    </w:p>
+    <w:p>
+      <w:pPr>
+        <w:pStyle w:val="Ttulo3"/>
+        <w:tabs>
+          <w:tab w:val="left" w:pos="2085"/>
+        </w:tabs>
+        <w:spacing w:before="281" w:after="281"/>
+        <w:rPr>
+          <w:rFonts w:ascii="Aptos" w:eastAsia="Aptos" w:hAnsi="Aptos" w:cs="Aptos"/>
+          <w:b/>
+          <w:bCs/>
+        </w:rPr>
+      </w:pPr>
+      <w:r>
+        <w:rPr>
+          <w:rFonts w:ascii="Aptos" w:eastAsia="Aptos" w:hAnsi="Aptos" w:cs="Aptos"/>
+          <w:b/>
+          <w:bCs/>
+        </w:rPr>
+        <w:t>7</w:t>
+      </w:r>
+      <w:r>
+        <w:rPr>
+          <w:rFonts w:ascii="Aptos" w:eastAsia="Aptos" w:hAnsi="Aptos" w:cs="Aptos"/>
+          <w:b/>
+          <w:bCs/>
+        </w:rPr>
+        <w:t xml:space="preserve">.1 </w:t>
+      </w:r>
+      <w:r>
+        <w:rPr>
+          <w:rFonts w:ascii="Aptos" w:eastAsia="Aptos" w:hAnsi="Aptos" w:cs="Aptos"/>
+          <w:b/>
+          <w:bCs/>
+        </w:rPr>
+        <w:t>Tabelas</w:t>
+      </w:r>
+      <w:r>
+        <w:rPr>
+          <w:rFonts w:ascii="Aptos" w:eastAsia="Aptos" w:hAnsi="Aptos" w:cs="Aptos"/>
+          <w:b/>
+          <w:bCs/>
+        </w:rPr>
+        <w:tab/>
       </w:r>
     </w:p>
     <w:p>
       <w:r>
-        <w:rPr>
-          <w:rFonts w:ascii="Consolas" w:eastAsia="Consolas" w:hAnsi="Consolas" w:cs="Consolas"/>
-        </w:rPr>
-        <w:t>USUARIO ---&lt; BILHETE &gt;--- RIFA</w:t>
+        <w:t>Este documento apresenta o dicionário de dados completo do </w:t>
       </w:r>
       <w:r>
-        <w:br/>
+        <w:rPr>
+          <w:i/>
+          <w:iCs/>
+        </w:rPr>
+        <w:t>Sistema de Sorteios e Rifas Online</w:t>
       </w:r>
       <w:r>
-        <w:rPr>
-          <w:rFonts w:ascii="Consolas" w:eastAsia="Consolas" w:hAnsi="Consolas" w:cs="Consolas"/>
-        </w:rPr>
-        <w:t>USUARIO ---&lt; PAGAMENTO &gt;--- RIFA</w:t>
+        <w:t>, elaborado com base no </w:t>
       </w:r>
       <w:r>
-        <w:br/>
+        <w:rPr>
+          <w:i/>
+          <w:iCs/>
+        </w:rPr>
+        <w:t>Documento de Visão e Especificação de Requisitos</w:t>
       </w:r>
       <w:r>
-        <w:rPr>
-          <w:rFonts w:ascii="Consolas" w:eastAsia="Consolas" w:hAnsi="Consolas" w:cs="Consolas"/>
-        </w:rPr>
-        <w:t>PAGAMENTO ---&lt; BILHETE (opcional)</w:t>
+        <w:t> (versão 1.1). O dicionário descreve todas as estruturas de dados necessárias para atender aos requisitos funcionais e não funcionais definidos, seguindo as práticas de documentação alinhadas à NBR ISO/IEC 12207 (Processos de ciclo de vida de software).</w:t>
+      </w:r>
+    </w:p>
+    <w:p>
+      <w:r>
+        <w:t>Foram contempladas as seguintes entidades:</w:t>
+      </w:r>
+    </w:p>
+    <w:p>
+      <w:pPr>
+        <w:numPr>
+          <w:ilvl w:val="0"/>
+          <w:numId w:val="7"/>
+        </w:numPr>
+      </w:pPr>
+      <w:r>
+        <w:rPr>
+          <w:b/>
+          <w:bCs/>
+        </w:rPr>
+        <w:t>USUARIO</w:t>
       </w:r>
       <w:r>
-        <w:br/>
+        <w:t> – Clientes e administradores.</w:t>
+      </w:r>
+    </w:p>
+    <w:p>
+      <w:pPr>
+        <w:numPr>
+          <w:ilvl w:val="0"/>
+          <w:numId w:val="7"/>
+        </w:numPr>
+      </w:pPr>
+      <w:r>
+        <w:rPr>
+          <w:b/>
+          <w:bCs/>
+        </w:rPr>
+        <w:t>RIFA</w:t>
       </w:r>
       <w:r>
-        <w:rPr>
-          <w:rFonts w:ascii="Consolas" w:eastAsia="Consolas" w:hAnsi="Consolas" w:cs="Consolas"/>
-        </w:rPr>
-        <w:t>RIFA ---&lt; SORTEIO</w:t>
+        <w:t> – Rifas cadastradas.</w:t>
+      </w:r>
+    </w:p>
+    <w:p>
+      <w:pPr>
+        <w:numPr>
+          <w:ilvl w:val="0"/>
+          <w:numId w:val="7"/>
+        </w:numPr>
+      </w:pPr>
+      <w:r>
+        <w:rPr>
+          <w:b/>
+          <w:bCs/>
+        </w:rPr>
+        <w:t>BILHETE</w:t>
       </w:r>
       <w:r>
-        <w:br/>
+        <w:t> – Bilhetes/números de cada rifa.</w:t>
+      </w:r>
+    </w:p>
+    <w:p>
+      <w:pPr>
+        <w:numPr>
+          <w:ilvl w:val="0"/>
+          <w:numId w:val="7"/>
+        </w:numPr>
+      </w:pPr>
+      <w:r>
+        <w:rPr>
+          <w:b/>
+          <w:bCs/>
+        </w:rPr>
+        <w:t>PAGAMENTO</w:t>
       </w:r>
       <w:r>
-        <w:rPr>
-          <w:rFonts w:ascii="Consolas" w:eastAsia="Consolas" w:hAnsi="Consolas" w:cs="Consolas"/>
-        </w:rPr>
-        <w:t>SORTEIO ---&lt; RESULTADO_SORTEIO</w:t>
+        <w:t> – Transações de pagamento.</w:t>
+      </w:r>
+    </w:p>
+    <w:p>
+      <w:pPr>
+        <w:numPr>
+          <w:ilvl w:val="0"/>
+          <w:numId w:val="7"/>
+        </w:numPr>
+      </w:pPr>
+      <w:r>
+        <w:rPr>
+          <w:b/>
+          <w:bCs/>
+        </w:rPr>
+        <w:t>REGISTRO_PAGAMENTO</w:t>
       </w:r>
       <w:r>
-        <w:br/>
+        <w:t> – Logs de integração com gateway.</w:t>
+      </w:r>
+    </w:p>
+    <w:p>
+      <w:pPr>
+        <w:numPr>
+          <w:ilvl w:val="0"/>
+          <w:numId w:val="7"/>
+        </w:numPr>
+      </w:pPr>
+      <w:r>
+        <w:rPr>
+          <w:b/>
+          <w:bCs/>
+        </w:rPr>
+        <w:t>REEMBOLSO</w:t>
       </w:r>
       <w:r>
-        <w:rPr>
-          <w:rFonts w:ascii="Consolas" w:eastAsia="Consolas" w:hAnsi="Consolas" w:cs="Consolas"/>
-        </w:rPr>
-        <w:t>USUARIO ---&lt; REEMBOLSO &gt;--- RIFA</w:t>
+        <w:t> – Solicitações de reembolso.</w:t>
+      </w:r>
+    </w:p>
+    <w:p>
+      <w:pPr>
+        <w:numPr>
+          <w:ilvl w:val="0"/>
+          <w:numId w:val="7"/>
+        </w:numPr>
+      </w:pPr>
+      <w:r>
+        <w:rPr>
+          <w:b/>
+          <w:bCs/>
+        </w:rPr>
+        <w:t>SORTEIO</w:t>
       </w:r>
       <w:r>
-        <w:br/>
+        <w:t> – Sorteios realizados.</w:t>
+      </w:r>
+    </w:p>
+    <w:p>
+      <w:pPr>
+        <w:numPr>
+          <w:ilvl w:val="0"/>
+          <w:numId w:val="7"/>
+        </w:numPr>
+      </w:pPr>
+      <w:r>
+        <w:rPr>
+          <w:b/>
+          <w:bCs/>
+        </w:rPr>
+        <w:t>RESULTADO_SORTEIO</w:t>
       </w:r>
       <w:r>
-        <w:rPr>
-          <w:rFonts w:ascii="Consolas" w:eastAsia="Consolas" w:hAnsi="Consolas" w:cs="Consolas"/>
-        </w:rPr>
-        <w:t>USUARIO ---&lt; NOTIFICACAO</w:t>
+        <w:t> – Detalhes do resultado do sorteio.</w:t>
+      </w:r>
+    </w:p>
+    <w:p>
+      <w:pPr>
+        <w:numPr>
+          <w:ilvl w:val="0"/>
+          <w:numId w:val="7"/>
+        </w:numPr>
+      </w:pPr>
+      <w:r>
+        <w:rPr>
+          <w:b/>
+          <w:bCs/>
+        </w:rPr>
+        <w:t>NOTIFICACAO</w:t>
       </w:r>
       <w:r>
-        <w:br/>
+        <w:t> – Envios de e-mail/SMS.</w:t>
+      </w:r>
+    </w:p>
+    <w:p>
+      <w:pPr>
+        <w:numPr>
+          <w:ilvl w:val="0"/>
+          <w:numId w:val="7"/>
+        </w:numPr>
+      </w:pPr>
+      <w:r>
+        <w:rPr>
+          <w:b/>
+          <w:bCs/>
+        </w:rPr>
+        <w:t>PAINEL_ADMIN</w:t>
       </w:r>
       <w:r>
-        <w:rPr>
-          <w:rFonts w:ascii="Aptos" w:eastAsia="Aptos" w:hAnsi="Aptos" w:cs="Aptos"/>
-        </w:rPr>
-        <w:t xml:space="preserve"> </w:t>
+        <w:t> – Controle de acesso baseado em papéis .</w:t>
       </w:r>
+    </w:p>
+    <w:p/>
+    <w:p>
+      <w:pPr>
+        <w:rPr>
+          <w:b/>
+          <w:bCs/>
+        </w:rPr>
+      </w:pPr>
+    </w:p>
+    <w:p/>
+    <w:p/>
+    <w:p>
+      <w:pPr>
+        <w:spacing w:before="240" w:after="240"/>
+      </w:pPr>
     </w:p>
     <w:p/>
     <w:p>
@@ -10683,7 +10918,6 @@
               <w:spacing w:after="0"/>
             </w:pPr>
             <w:r>
-              <w:lastRenderedPageBreak/>
               <w:t>RN06</w:t>
             </w:r>
           </w:p>
@@ -10925,6 +11159,7 @@
           <w:sz w:val="36"/>
           <w:szCs w:val="36"/>
         </w:rPr>
+        <w:lastRenderedPageBreak/>
         <w:t>8. Matriz de rastreabilidade (exemplo)</w:t>
       </w:r>
     </w:p>
@@ -12040,7 +12275,6 @@
               <w:spacing w:after="0"/>
             </w:pPr>
             <w:r>
-              <w:lastRenderedPageBreak/>
               <w:t>UC03</w:t>
             </w:r>
           </w:p>
@@ -12477,6 +12711,7 @@
               <w:spacing w:after="0"/>
             </w:pPr>
             <w:r>
+              <w:lastRenderedPageBreak/>
               <w:t>UC07</w:t>
             </w:r>
           </w:p>
@@ -13013,7 +13248,6 @@
           <w:b/>
           <w:bCs/>
         </w:rPr>
-        <w:lastRenderedPageBreak/>
         <w:t>Versão 3.0 (futuro)</w:t>
       </w:r>
     </w:p>
@@ -13069,7 +13303,7 @@
 </file>
 
 <file path=word/numbering.xml><?xml version="1.0" encoding="utf-8"?>
-<w:numbering xmlns:wpc="http://schemas.microsoft.com/office/word/2010/wordprocessingCanvas" xmlns:cx="http://schemas.microsoft.com/office/drawing/2014/chartex" xmlns:cx1="http://schemas.microsoft.com/office/drawing/2015/9/8/chartex" xmlns:cx2="http://schemas.microsoft.com/office/drawing/2015/10/21/chartex" xmlns:cx3="http://schemas.microsoft.com/office/drawing/2016/5/9/chartex" xmlns:cx4="http://schemas.microsoft.com/office/drawing/2016/5/10/chartex" xmlns:cx5="http://schemas.microsoft.com/office/drawing/2016/5/11/chartex" xmlns:cx6="http://schemas.microsoft.com/office/drawing/2016/5/12/chartex" xmlns:cx7="http://schemas.microsoft.com/office/drawing/2016/5/13/chartex" xmlns:cx8="http://schemas.microsoft.com/office/drawing/2016/5/14/chartex" xmlns:mc="http://schemas.openxmlformats.org/markup-compatibility/2006" xmlns:aink="http://schemas.microsoft.com/office/drawing/2016/ink" xmlns:am3d="http://schemas.microsoft.com/office/drawing/2017/model3d" xmlns:o="urn:schemas-microsoft-com:office:office" xmlns:oel="http://schemas.microsoft.com/office/2019/extlst" xmlns:r="http://schemas.openxmlformats.org/officeDocument/2006/relationships" xmlns:m="http://schemas.openxmlformats.org/officeDocument/2006/math" xmlns:v="urn:schemas-microsoft-com:vml" xmlns:wp14="http://schemas.microsoft.com/office/word/2010/wordprocessingDrawing" xmlns:wp="http://schemas.openxmlformats.org/drawingml/2006/wordprocessingDrawing" xmlns:w10="urn:schemas-microsoft-com:office:word" xmlns:w="http://schemas.openxmlformats.org/wordprocessingml/2006/main" xmlns:w14="http://schemas.microsoft.com/office/word/2010/wordml" xmlns:w15="http://schemas.microsoft.com/office/word/2012/wordml" xmlns:w16cex="http://schemas.microsoft.com/office/word/2018/wordml/cex" xmlns:w16cid="http://schemas.microsoft.com/office/word/2016/wordml/cid" xmlns:w16="http://schemas.microsoft.com/office/word/2018/wordml" xmlns:w16du="http://schemas.microsoft.com/office/word/2023/wordml/word16du" xmlns:w16sdtdh="http://schemas.microsoft.com/office/word/2020/wordml/sdtdatahash" xmlns:w16sdtfl="http://schemas.microsoft.com/office/word/2024/wordml/sdtformatlock" xmlns:w16se="http://schemas.microsoft.com/office/word/2015/wordml/symex" xmlns:wpg="http://schemas.microsoft.com/office/word/2010/wordprocessingGroup" xmlns:wpi="http://schemas.microsoft.com/office/word/2010/wordprocessingInk" xmlns:wne="http://schemas.microsoft.com/office/word/2006/wordml" xmlns:wps="http://schemas.microsoft.com/office/word/2010/wordprocessingShape" mc:Ignorable="w14 w15 w16se w16cid w16 w16cex w16sdtdh w16sdtfl w16du wp14">
+<w:numbering xmlns:wpc="http://schemas.microsoft.com/office/word/2010/wordprocessingCanvas" xmlns:cx="http://schemas.microsoft.com/office/drawing/2014/chartex" xmlns:cx1="http://schemas.microsoft.com/office/drawing/2015/9/8/chartex" xmlns:cx2="http://schemas.microsoft.com/office/drawing/2015/10/21/chartex" xmlns:cx3="http://schemas.microsoft.com/office/drawing/2016/5/9/chartex" xmlns:cx4="http://schemas.microsoft.com/office/drawing/2016/5/10/chartex" xmlns:cx5="http://schemas.microsoft.com/office/drawing/2016/5/11/chartex" xmlns:cx6="http://schemas.microsoft.com/office/drawing/2016/5/12/chartex" xmlns:cx7="http://schemas.microsoft.com/office/drawing/2016/5/13/chartex" xmlns:cx8="http://schemas.microsoft.com/office/drawing/2016/5/14/chartex" xmlns:mc="http://schemas.openxmlformats.org/markup-compatibility/2006" xmlns:aink="http://schemas.microsoft.com/office/drawing/2016/ink" xmlns:am3d="http://schemas.microsoft.com/office/drawing/2017/model3d" xmlns:o="urn:schemas-microsoft-com:office:office" xmlns:oel="http://schemas.microsoft.com/office/2019/extlst" xmlns:r="http://schemas.openxmlformats.org/officeDocument/2006/relationships" xmlns:m="http://schemas.openxmlformats.org/officeDocument/2006/math" xmlns:v="urn:schemas-microsoft-com:vml" xmlns:wp14="http://schemas.microsoft.com/office/word/2010/wordprocessingDrawing" xmlns:wp="http://schemas.openxmlformats.org/drawingml/2006/wordprocessingDrawing" xmlns:w10="urn:schemas-microsoft-com:office:word" xmlns:w="http://schemas.openxmlformats.org/wordprocessingml/2006/main" xmlns:w14="http://schemas.microsoft.com/office/word/2010/wordml" xmlns:w15="http://schemas.microsoft.com/office/word/2012/wordml" xmlns:w16cex="http://schemas.microsoft.com/office/word/2018/wordml/cex" xmlns:w16cid="http://schemas.microsoft.com/office/word/2016/wordml/cid" xmlns:w16="http://schemas.microsoft.com/office/word/2018/wordml" xmlns:w16sdtdh="http://schemas.microsoft.com/office/word/2020/wordml/sdtdatahash" xmlns:w16se="http://schemas.microsoft.com/office/word/2015/wordml/symex" xmlns:wpg="http://schemas.microsoft.com/office/word/2010/wordprocessingGroup" xmlns:wpi="http://schemas.microsoft.com/office/word/2010/wordprocessingInk" xmlns:wne="http://schemas.microsoft.com/office/word/2006/wordml" xmlns:wps="http://schemas.microsoft.com/office/word/2010/wordprocessingShape" mc:Ignorable="w14 w15 w16se w16cid w16 w16cex w16sdtdh wp14">
   <w:abstractNum w:abstractNumId="0" w15:restartNumberingAfterBreak="0">
     <w:nsid w:val="0AF94FB6"/>
     <w:multiLevelType w:val="hybridMultilevel"/>
@@ -13718,6 +13952,155 @@
       </w:pPr>
       <w:rPr>
         <w:rFonts w:ascii="Wingdings" w:hAnsi="Wingdings" w:hint="default"/>
+      </w:rPr>
+    </w:lvl>
+  </w:abstractNum>
+  <w:abstractNum w:abstractNumId="6" w15:restartNumberingAfterBreak="0">
+    <w:nsid w:val="7E392134"/>
+    <w:multiLevelType w:val="multilevel"/>
+    <w:tmpl w:val="FD7E6428"/>
+    <w:lvl w:ilvl="0">
+      <w:start w:val="1"/>
+      <w:numFmt w:val="bullet"/>
+      <w:lvlText w:val=""/>
+      <w:lvlJc w:val="left"/>
+      <w:pPr>
+        <w:tabs>
+          <w:tab w:val="num" w:pos="720"/>
+        </w:tabs>
+        <w:ind w:left="720" w:hanging="360"/>
+      </w:pPr>
+      <w:rPr>
+        <w:rFonts w:ascii="Symbol" w:hAnsi="Symbol" w:hint="default"/>
+        <w:sz w:val="20"/>
+      </w:rPr>
+    </w:lvl>
+    <w:lvl w:ilvl="1" w:tentative="1">
+      <w:start w:val="1"/>
+      <w:numFmt w:val="bullet"/>
+      <w:lvlText w:val="o"/>
+      <w:lvlJc w:val="left"/>
+      <w:pPr>
+        <w:tabs>
+          <w:tab w:val="num" w:pos="1440"/>
+        </w:tabs>
+        <w:ind w:left="1440" w:hanging="360"/>
+      </w:pPr>
+      <w:rPr>
+        <w:rFonts w:ascii="Courier New" w:hAnsi="Courier New" w:hint="default"/>
+        <w:sz w:val="20"/>
+      </w:rPr>
+    </w:lvl>
+    <w:lvl w:ilvl="2" w:tentative="1">
+      <w:start w:val="1"/>
+      <w:numFmt w:val="bullet"/>
+      <w:lvlText w:val=""/>
+      <w:lvlJc w:val="left"/>
+      <w:pPr>
+        <w:tabs>
+          <w:tab w:val="num" w:pos="2160"/>
+        </w:tabs>
+        <w:ind w:left="2160" w:hanging="360"/>
+      </w:pPr>
+      <w:rPr>
+        <w:rFonts w:ascii="Wingdings" w:hAnsi="Wingdings" w:hint="default"/>
+        <w:sz w:val="20"/>
+      </w:rPr>
+    </w:lvl>
+    <w:lvl w:ilvl="3" w:tentative="1">
+      <w:start w:val="1"/>
+      <w:numFmt w:val="bullet"/>
+      <w:lvlText w:val=""/>
+      <w:lvlJc w:val="left"/>
+      <w:pPr>
+        <w:tabs>
+          <w:tab w:val="num" w:pos="2880"/>
+        </w:tabs>
+        <w:ind w:left="2880" w:hanging="360"/>
+      </w:pPr>
+      <w:rPr>
+        <w:rFonts w:ascii="Wingdings" w:hAnsi="Wingdings" w:hint="default"/>
+        <w:sz w:val="20"/>
+      </w:rPr>
+    </w:lvl>
+    <w:lvl w:ilvl="4" w:tentative="1">
+      <w:start w:val="1"/>
+      <w:numFmt w:val="bullet"/>
+      <w:lvlText w:val=""/>
+      <w:lvlJc w:val="left"/>
+      <w:pPr>
+        <w:tabs>
+          <w:tab w:val="num" w:pos="3600"/>
+        </w:tabs>
+        <w:ind w:left="3600" w:hanging="360"/>
+      </w:pPr>
+      <w:rPr>
+        <w:rFonts w:ascii="Wingdings" w:hAnsi="Wingdings" w:hint="default"/>
+        <w:sz w:val="20"/>
+      </w:rPr>
+    </w:lvl>
+    <w:lvl w:ilvl="5" w:tentative="1">
+      <w:start w:val="1"/>
+      <w:numFmt w:val="bullet"/>
+      <w:lvlText w:val=""/>
+      <w:lvlJc w:val="left"/>
+      <w:pPr>
+        <w:tabs>
+          <w:tab w:val="num" w:pos="4320"/>
+        </w:tabs>
+        <w:ind w:left="4320" w:hanging="360"/>
+      </w:pPr>
+      <w:rPr>
+        <w:rFonts w:ascii="Wingdings" w:hAnsi="Wingdings" w:hint="default"/>
+        <w:sz w:val="20"/>
+      </w:rPr>
+    </w:lvl>
+    <w:lvl w:ilvl="6" w:tentative="1">
+      <w:start w:val="1"/>
+      <w:numFmt w:val="bullet"/>
+      <w:lvlText w:val=""/>
+      <w:lvlJc w:val="left"/>
+      <w:pPr>
+        <w:tabs>
+          <w:tab w:val="num" w:pos="5040"/>
+        </w:tabs>
+        <w:ind w:left="5040" w:hanging="360"/>
+      </w:pPr>
+      <w:rPr>
+        <w:rFonts w:ascii="Wingdings" w:hAnsi="Wingdings" w:hint="default"/>
+        <w:sz w:val="20"/>
+      </w:rPr>
+    </w:lvl>
+    <w:lvl w:ilvl="7" w:tentative="1">
+      <w:start w:val="1"/>
+      <w:numFmt w:val="bullet"/>
+      <w:lvlText w:val=""/>
+      <w:lvlJc w:val="left"/>
+      <w:pPr>
+        <w:tabs>
+          <w:tab w:val="num" w:pos="5760"/>
+        </w:tabs>
+        <w:ind w:left="5760" w:hanging="360"/>
+      </w:pPr>
+      <w:rPr>
+        <w:rFonts w:ascii="Wingdings" w:hAnsi="Wingdings" w:hint="default"/>
+        <w:sz w:val="20"/>
+      </w:rPr>
+    </w:lvl>
+    <w:lvl w:ilvl="8" w:tentative="1">
+      <w:start w:val="1"/>
+      <w:numFmt w:val="bullet"/>
+      <w:lvlText w:val=""/>
+      <w:lvlJc w:val="left"/>
+      <w:pPr>
+        <w:tabs>
+          <w:tab w:val="num" w:pos="6480"/>
+        </w:tabs>
+        <w:ind w:left="6480" w:hanging="360"/>
+      </w:pPr>
+      <w:rPr>
+        <w:rFonts w:ascii="Wingdings" w:hAnsi="Wingdings" w:hint="default"/>
+        <w:sz w:val="20"/>
       </w:rPr>
     </w:lvl>
   </w:abstractNum>
@@ -13739,11 +14122,14 @@
   <w:num w:numId="6" w16cid:durableId="1640722546">
     <w:abstractNumId w:val="2"/>
   </w:num>
+  <w:num w:numId="7" w16cid:durableId="1947155835">
+    <w:abstractNumId w:val="6"/>
+  </w:num>
 </w:numbering>
 </file>
 
 <file path=word/styles.xml><?xml version="1.0" encoding="utf-8"?>
-<w:styles xmlns:mc="http://schemas.openxmlformats.org/markup-compatibility/2006" xmlns:r="http://schemas.openxmlformats.org/officeDocument/2006/relationships" xmlns:w="http://schemas.openxmlformats.org/wordprocessingml/2006/main" xmlns:w14="http://schemas.microsoft.com/office/word/2010/wordml" xmlns:w15="http://schemas.microsoft.com/office/word/2012/wordml" xmlns:w16cex="http://schemas.microsoft.com/office/word/2018/wordml/cex" xmlns:w16cid="http://schemas.microsoft.com/office/word/2016/wordml/cid" xmlns:w16="http://schemas.microsoft.com/office/word/2018/wordml" xmlns:w16du="http://schemas.microsoft.com/office/word/2023/wordml/word16du" xmlns:w16sdtdh="http://schemas.microsoft.com/office/word/2020/wordml/sdtdatahash" xmlns:w16sdtfl="http://schemas.microsoft.com/office/word/2024/wordml/sdtformatlock" xmlns:w16se="http://schemas.microsoft.com/office/word/2015/wordml/symex" mc:Ignorable="w14 w15 w16se w16cid w16 w16cex w16sdtdh w16sdtfl w16du">
+<w:styles xmlns:mc="http://schemas.openxmlformats.org/markup-compatibility/2006" xmlns:r="http://schemas.openxmlformats.org/officeDocument/2006/relationships" xmlns:w="http://schemas.openxmlformats.org/wordprocessingml/2006/main" xmlns:w14="http://schemas.microsoft.com/office/word/2010/wordml" xmlns:w15="http://schemas.microsoft.com/office/word/2012/wordml" xmlns:w16cex="http://schemas.microsoft.com/office/word/2018/wordml/cex" xmlns:w16cid="http://schemas.microsoft.com/office/word/2016/wordml/cid" xmlns:w16="http://schemas.microsoft.com/office/word/2018/wordml" xmlns:w16sdtdh="http://schemas.microsoft.com/office/word/2020/wordml/sdtdatahash" xmlns:w16se="http://schemas.microsoft.com/office/word/2015/wordml/symex" mc:Ignorable="w14 w15 w16se w16cid w16 w16cex w16sdtdh">
   <w:docDefaults>
     <w:rPrDefault>
       <w:rPr>
@@ -14206,7 +14592,6 @@
   <w:style w:type="character" w:default="1" w:styleId="Fontepargpadro">
     <w:name w:val="Default Paragraph Font"/>
     <w:uiPriority w:val="1"/>
-    <w:semiHidden/>
     <w:unhideWhenUsed/>
   </w:style>
   <w:style w:type="table" w:default="1" w:styleId="Tabelanormal">
@@ -14533,4 +14918,16 @@
     </a:ext>
   </a:extLst>
 </a:theme>
+</file>
+
+<file path=customXml/item1.xml><?xml version="1.0" encoding="utf-8"?>
+<b:Sources xmlns:b="http://schemas.openxmlformats.org/officeDocument/2006/bibliography" xmlns="http://schemas.openxmlformats.org/officeDocument/2006/bibliography" SelectedStyle="\APASixthEditionOfficeOnline.xsl" StyleName="APA" Version="6"/>
+</file>
+
+<file path=customXml/itemProps1.xml><?xml version="1.0" encoding="utf-8"?>
+<ds:datastoreItem xmlns:ds="http://schemas.openxmlformats.org/officeDocument/2006/customXml" ds:itemID="{003D1CB6-F7D3-47CE-8020-B32DA504FA16}">
+  <ds:schemaRefs>
+    <ds:schemaRef ds:uri="http://schemas.openxmlformats.org/officeDocument/2006/bibliography"/>
+  </ds:schemaRefs>
+</ds:datastoreItem>
 </file>
</xml_diff>